<commit_message>
docs(A2): align video + checklist to the real A2 rubric
- Storyboard: add a Figma design beat (Part B requires the video to show
  the Figma design) and an explicit camera-on / face-visible requirement.
- Checklist: note the video is graded across all criteria, list Part B
  video requirements, flag the unit-testing per-functionality screenshot
  nuance, and record the projected per-criterion marks (HD ~88).

Co-Authored-By: Claude Opus 4.8 <noreply@anthropic.com>
Claude-Session: https://claude.ai/code/session_018qvo2YYVSdyAShj3w4tzaz
</commit_message>
<xml_diff>
--- a/docs/A2/SUBMISSION_CHECKLIST.docx
+++ b/docs/A2/SUBMISSION_CHECKLIST.docx
@@ -17,7 +17,7 @@
           <w:color w:val="555555"/>
           <w:sz w:val="18"/>
         </w:rPr>
-        <w:t>David (Anrio) Carver · 11473215 · due 3 July 2026 · work through in order</w:t>
+        <w:t>David (Anrio) Carver · 11473215 · due 3 July 2026 · graded against the real A2 rubric (HD ≈ 88 projected)</w:t>
       </w:r>
     </w:p>
     <w:p>
@@ -25,7 +25,22 @@
         <w:pStyle w:val="Heading2"/>
       </w:pPr>
       <w:r>
-        <w:t>CRITICAL — do these first (A1 lesson: a missing/broken item = near-zero on that criterion)</w:t>
+        <w:t>CRITICAL — every rubric criterion is graded on the report AND the video</w:t>
+      </w:r>
+    </w:p>
+    <w:p>
+      <w:pPr>
+        <w:pStyle w:val="ListBullet"/>
+      </w:pPr>
+      <w:r>
+        <w:rPr>
+          <w:b/>
+          <w:color w:val="C00000"/>
+        </w:rPr>
+        <w:t xml:space="preserve">Record a strong 10-min solo demo. </w:t>
+      </w:r>
+      <w:r>
+        <w:t>The video counts toward ALL 100 marks (each criterion says "presentation in report and video demonstration"). A weak/missing video drags down every criterion — this is your highest-leverage task.</w:t>
       </w:r>
     </w:p>
     <w:p>
@@ -40,7 +55,7 @@
         <w:t xml:space="preserve">Confirm the live IP. </w:t>
       </w:r>
       <w:r>
-        <w:t>Start the EC2 instance, note the NEW public IP, and update it in BOTH the report §7.4 and the README. A dead live-link is your "only two SysML diagrams" moment.</w:t>
+        <w:t>Start EC2, get the NEW public IP, update it in report §7.4 AND README. A dead live-link is your "only two SysML diagrams" moment from A1.</w:t>
       </w:r>
     </w:p>
     <w:p>
@@ -55,7 +70,43 @@
         <w:t xml:space="preserve">Verify the app actually works. </w:t>
       </w:r>
       <w:r>
-        <w:t>Open the live URL yourself in a clean browser — browse, log in, post a review, see the notification. If it 502s, wait ~10s (pm2 restarting).</w:t>
+        <w:t>Open the live URL and run through browse → login → post review → notification before recording.</w:t>
+      </w:r>
+    </w:p>
+    <w:p>
+      <w:pPr>
+        <w:pStyle w:val="Heading2"/>
+      </w:pPr>
+      <w:r>
+        <w:t>Video must include (Part B requirements)</w:t>
+      </w:r>
+    </w:p>
+    <w:p>
+      <w:pPr>
+        <w:pStyle w:val="ListBullet"/>
+      </w:pPr>
+      <w:r>
+        <w:rPr>
+          <w:b/>
+        </w:rPr>
+        <w:t xml:space="preserve">✔ </w:t>
+      </w:r>
+      <w:r>
+        <w:t>Live product demo on the public URL.</w:t>
+      </w:r>
+    </w:p>
+    <w:p>
+      <w:pPr>
+        <w:pStyle w:val="ListBullet"/>
+      </w:pPr>
+      <w:r>
+        <w:rPr>
+          <w:b/>
+        </w:rPr>
+        <w:t xml:space="preserve">✔ Figma: </w:t>
+      </w:r>
+      <w:r>
+        <w:t>Your Figma design — wireframes + interactive prototype (storyboard now has a 2:20–2:50 Figma beat).</w:t>
       </w:r>
     </w:p>
     <w:p>
@@ -67,18 +118,10 @@
           <w:b/>
           <w:color w:val="C00000"/>
         </w:rPr>
-        <w:t xml:space="preserve">Record the video. </w:t>
+        <w:t xml:space="preserve">✔ Camera on: </w:t>
       </w:r>
       <w:r>
-        <w:t>Record the 10-minute solo video from docs/A2/video-storyboard.docx. Unrecorded = zero for the demo. Keep EC2 running the whole time.</w:t>
-      </w:r>
-    </w:p>
-    <w:p>
-      <w:pPr>
-        <w:pStyle w:val="Heading2"/>
-      </w:pPr>
-      <w:r>
-        <w:t>Documents to finalise</w:t>
+        <w:t>Your face on camera throughout — enable camera in Canvas Studio full-screen. Stated academic-integrity requirement.</w:t>
       </w:r>
     </w:p>
     <w:p>
@@ -89,10 +132,54 @@
         <w:rPr>
           <w:b/>
         </w:rPr>
-        <w:t xml:space="preserve">Export report to PDF. </w:t>
+        <w:t xml:space="preserve">✔ Upload: </w:t>
       </w:r>
       <w:r>
-        <w:t>Open in Word and File → Save As → PDF (LibreOffice export is broken; Word is fine).</w:t>
+        <w:t>Upload via Canvas Studio to "Assignment 2: Video submission" (NOT a file upload).</w:t>
+      </w:r>
+    </w:p>
+    <w:p>
+      <w:pPr>
+        <w:pStyle w:val="Heading2"/>
+      </w:pPr>
+      <w:r>
+        <w:t>Strengthen the borderline criterion (Unit testing, 12 pts)</w:t>
+      </w:r>
+    </w:p>
+    <w:p>
+      <w:pPr>
+        <w:pStyle w:val="ListBullet"/>
+      </w:pPr>
+      <w:r>
+        <w:rPr>
+          <w:b/>
+        </w:rPr>
+        <w:t xml:space="preserve">Optional safety: </w:t>
+      </w:r>
+      <w:r>
+        <w:t>HD wants pass/fail screenshots for ALL functionalities (create/update/delete/fetch). You have one aggregate 49-passing shot + the full matrix. Consider adding a couple of grouped per-area screenshots (e.g. review CRUD, auth) to lock in HD. The matrix (TC ID / Expected / Actual) is already strong.</w:t>
+      </w:r>
+    </w:p>
+    <w:p>
+      <w:pPr>
+        <w:pStyle w:val="Heading2"/>
+      </w:pPr>
+      <w:r>
+        <w:t>Documents</w:t>
+      </w:r>
+    </w:p>
+    <w:p>
+      <w:pPr>
+        <w:pStyle w:val="ListBullet"/>
+      </w:pPr>
+      <w:r>
+        <w:rPr>
+          <w:b/>
+        </w:rPr>
+        <w:t xml:space="preserve">Export to PDF. </w:t>
+      </w:r>
+      <w:r>
+        <w:t>Open in Word → File → Save As → PDF (report + Part C).</w:t>
       </w:r>
     </w:p>
     <w:p>
@@ -106,7 +193,7 @@
         <w:t xml:space="preserve">Sign Part C. </w:t>
       </w:r>
       <w:r>
-        <w:t>Sign + date your row; Cameron’s row already marked "withdrew". Export to PDF.</w:t>
+        <w:t>Your signature + date on Part C (Cameron’s row already marked "withdrew").</w:t>
       </w:r>
     </w:p>
     <w:p>
@@ -117,10 +204,10 @@
         <w:rPr>
           <w:b/>
         </w:rPr>
-        <w:t xml:space="preserve">Final read-through. </w:t>
+        <w:t xml:space="preserve">Update public README. </w:t>
       </w:r>
       <w:r>
-        <w:t>Confirm no [INSERT]/[TEAM] placeholders remain (none as of last check) and the IP matches the report.</w:t>
+        <w:t>Paste the corrected README into the public repo (still shows old A1/Render until you do).</w:t>
       </w:r>
     </w:p>
     <w:p>
@@ -128,7 +215,7 @@
         <w:pStyle w:val="Heading2"/>
       </w:pPr>
       <w:r>
-        <w:t>Consistency (A1 lesson: this marker reads the repo against the report)</w:t>
+        <w:t>Protective</w:t>
       </w:r>
     </w:p>
     <w:p>
@@ -139,10 +226,18 @@
         <w:rPr>
           <w:b/>
         </w:rPr>
-        <w:t xml:space="preserve">Update the public repo README. </w:t>
+        <w:t xml:space="preserve">Email the coordinator. </w:t>
       </w:r>
       <w:r>
-        <w:t>Paste the corrected README into github.com/david1carver/restaurant-review-platform → main. It still shows the old A1/Render story until you do.</w:t>
+        <w:t>Send the coordinator email (docs/A2/coordinator_email_team_change.txt). Team Collaboration (10 pts) is the one solo-capped criterion — the email helps it be graded fairly.</w:t>
+      </w:r>
+    </w:p>
+    <w:p>
+      <w:pPr>
+        <w:pStyle w:val="Heading2"/>
+      </w:pPr>
+      <w:r>
+        <w:t>Submit before 11:59pm AEST, 3 July</w:t>
       </w:r>
     </w:p>
     <w:p>
@@ -153,10 +248,10 @@
         <w:rPr>
           <w:b/>
         </w:rPr>
-        <w:t xml:space="preserve">Check the GitHub links. </w:t>
+        <w:t xml:space="preserve">Three submissions: </w:t>
       </w:r>
       <w:r>
-        <w:t>Repo link in the report resolves; branches (feature/contrib-*, feature/log-*) and the merged PR #1 are visible for §4.2.</w:t>
+        <w:t>Report PDF (via "Start Assignment"), Part C PDF (separate submission), and the Canvas Studio video. GitHub link + public IP must be in the report.</w:t>
       </w:r>
     </w:p>
     <w:p>
@@ -164,7 +259,7 @@
         <w:pStyle w:val="Heading2"/>
       </w:pPr>
       <w:r>
-        <w:t>Protective step</w:t>
+        <w:t>Projected marks (real rubric)</w:t>
       </w:r>
     </w:p>
     <w:p>
@@ -172,21 +267,7 @@
         <w:pStyle w:val="ListBullet"/>
       </w:pPr>
       <w:r>
-        <w:rPr>
-          <w:b/>
-        </w:rPr>
-        <w:t xml:space="preserve">Email the unit coordinator. </w:t>
-      </w:r>
-      <w:r>
-        <w:t>Send the coordinator email (docs/A2/coordinator_email_team_change.txt) — on record before submission, it helps the Team-Collaboration criterion be graded fairly for a solo.</w:t>
-      </w:r>
-    </w:p>
-    <w:p>
-      <w:pPr>
-        <w:pStyle w:val="Heading2"/>
-      </w:pPr>
-      <w:r>
-        <w:t>Submit</w:t>
+        <w:t>SRS 9/10 · Patterns+OOP 25.5/28 · Team collab 7/10 · API 11/12 · Unit testing 10.5/12 · CI/CD 11/12 · README+report+reflection 14/16</w:t>
       </w:r>
     </w:p>
     <w:p>
@@ -194,53 +275,7 @@
         <w:pStyle w:val="ListBullet"/>
       </w:pPr>
       <w:r>
-        <w:rPr>
-          <w:b/>
-        </w:rPr>
-        <w:t xml:space="preserve">Upload to Canvas. </w:t>
-      </w:r>
-      <w:r>
-        <w:t>One PDF: report (with all embedded evidence). One PDF: Part C declaration. Plus the video to Canvas Studio. Submit before 3 July.</w:t>
-      </w:r>
-    </w:p>
-    <w:p>
-      <w:pPr>
-        <w:pStyle w:val="Heading2"/>
-      </w:pPr>
-      <w:r>
-        <w:t>What A1 taught us about this marker</w:t>
-      </w:r>
-    </w:p>
-    <w:p>
-      <w:pPr>
-        <w:pStyle w:val="ListBullet"/>
-      </w:pPr>
-      <w:r>
-        <w:t>Counts required artefacts literally — completeness beats polish. Make sure every rubric-listed screenshot is present.</w:t>
-      </w:r>
-    </w:p>
-    <w:p>
-      <w:pPr>
-        <w:pStyle w:val="ListBullet"/>
-      </w:pPr>
-      <w:r>
-        <w:t>Rewards clearly-separated discussion (now fixed in §Discussion) and good documentation (you scored 12/12 on README+report in A1).</w:t>
-      </w:r>
-    </w:p>
-    <w:p>
-      <w:pPr>
-        <w:pStyle w:val="ListBullet"/>
-      </w:pPr>
-      <w:r>
-        <w:t>Gave 12/12 for structured branching in A1 — your solo branch/PR/merge evidence should still score well.</w:t>
-      </w:r>
-    </w:p>
-    <w:p>
-      <w:pPr>
-        <w:pStyle w:val="ListBullet"/>
-      </w:pPr>
-      <w:r>
-        <w:t>Checks that things actually work (A1: "prototype isn’t interactive") — so the live demo must genuinely run.</w:t>
+        <w:t>Total ≈ 88/100 (High Distinction). The video and a live IP are the two things that protect this mark.</w:t>
       </w:r>
     </w:p>
     <w:sectPr>

</xml_diff>